<commit_message>
[feat] update graphs and word file
</commit_message>
<xml_diff>
--- a/theory.docx
+++ b/theory.docx
@@ -2395,7 +2395,7 @@
                 <w:noProof/>
                 <w:webHidden/>
               </w:rPr>
-              <w:t>9</w:t>
+              <w:t>10</w:t>
             </w:r>
             <w:r>
               <w:rPr>
@@ -2482,7 +2482,7 @@
                 <w:noProof/>
                 <w:webHidden/>
               </w:rPr>
-              <w:t>10</w:t>
+              <w:t>11</w:t>
             </w:r>
             <w:r>
               <w:rPr>
@@ -2569,7 +2569,7 @@
                 <w:noProof/>
                 <w:webHidden/>
               </w:rPr>
-              <w:t>11</w:t>
+              <w:t>12</w:t>
             </w:r>
             <w:r>
               <w:rPr>
@@ -2656,7 +2656,7 @@
                 <w:noProof/>
                 <w:webHidden/>
               </w:rPr>
-              <w:t>14</w:t>
+              <w:t>15</w:t>
             </w:r>
             <w:r>
               <w:rPr>
@@ -2974,10 +2974,10 @@
             <v:path o:extrusionok="f" gradientshapeok="t" o:connecttype="rect"/>
             <o:lock v:ext="edit" aspectratio="t"/>
           </v:shapetype>
-          <v:shape id="_x0000_i1025" type="#_x0000_t75" style="width:12pt;height:18pt" o:ole="">
+          <v:shape id="_x0000_i1025" type="#_x0000_t75" style="width:12pt;height:18.5pt" o:ole="">
             <v:imagedata r:id="rId15" o:title=""/>
           </v:shape>
-          <o:OLEObject Type="Embed" ProgID="Equation.DSMT4" ShapeID="_x0000_i1025" DrawAspect="Content" ObjectID="_1844883278" r:id="rId16"/>
+          <o:OLEObject Type="Embed" ProgID="Equation.DSMT4" ShapeID="_x0000_i1025" DrawAspect="Content" ObjectID="_1846611383" r:id="rId16"/>
         </w:object>
       </w:r>
       <w:r>
@@ -2991,10 +2991,10 @@
           <w:position w:val="-12"/>
         </w:rPr>
         <w:object w:dxaOrig="279" w:dyaOrig="360" w14:anchorId="0133F332">
-          <v:shape id="_x0000_i1026" type="#_x0000_t75" style="width:14.25pt;height:18pt" o:ole="">
+          <v:shape id="_x0000_i1026" type="#_x0000_t75" style="width:14.5pt;height:18.5pt" o:ole="">
             <v:imagedata r:id="rId17" o:title=""/>
           </v:shape>
-          <o:OLEObject Type="Embed" ProgID="Equation.DSMT4" ShapeID="_x0000_i1026" DrawAspect="Content" ObjectID="_1844883279" r:id="rId18"/>
+          <o:OLEObject Type="Embed" ProgID="Equation.DSMT4" ShapeID="_x0000_i1026" DrawAspect="Content" ObjectID="_1846611384" r:id="rId18"/>
         </w:object>
       </w:r>
       <w:r>
@@ -3008,7 +3008,7 @@
           <v:shape id="_x0000_i1027" type="#_x0000_t75" style="width:12pt;height:12pt" o:ole="">
             <v:imagedata r:id="rId19" o:title=""/>
           </v:shape>
-          <o:OLEObject Type="Embed" ProgID="Equation.DSMT4" ShapeID="_x0000_i1027" DrawAspect="Content" ObjectID="_1844883280" r:id="rId20"/>
+          <o:OLEObject Type="Embed" ProgID="Equation.DSMT4" ShapeID="_x0000_i1027" DrawAspect="Content" ObjectID="_1846611385" r:id="rId20"/>
         </w:object>
       </w:r>
       <w:r>
@@ -3034,7 +3034,7 @@
           <v:shape id="_x0000_i1028" type="#_x0000_t75" style="width:12pt;height:10.5pt" o:ole="">
             <v:imagedata r:id="rId21" o:title=""/>
           </v:shape>
-          <o:OLEObject Type="Embed" ProgID="Equation.DSMT4" ShapeID="_x0000_i1028" DrawAspect="Content" ObjectID="_1844883281" r:id="rId22"/>
+          <o:OLEObject Type="Embed" ProgID="Equation.DSMT4" ShapeID="_x0000_i1028" DrawAspect="Content" ObjectID="_1846611386" r:id="rId22"/>
         </w:object>
       </w:r>
       <w:r>
@@ -3051,7 +3051,7 @@
           <v:shape id="_x0000_i1029" type="#_x0000_t75" style="width:10.5pt;height:12pt" o:ole="">
             <v:imagedata r:id="rId23" o:title=""/>
           </v:shape>
-          <o:OLEObject Type="Embed" ProgID="Equation.DSMT4" ShapeID="_x0000_i1029" DrawAspect="Content" ObjectID="_1844883282" r:id="rId24"/>
+          <o:OLEObject Type="Embed" ProgID="Equation.DSMT4" ShapeID="_x0000_i1029" DrawAspect="Content" ObjectID="_1846611387" r:id="rId24"/>
         </w:object>
       </w:r>
       <w:r>
@@ -3378,10 +3378,10 @@
           <w:lang w:val="en-CA"/>
         </w:rPr>
         <w:object w:dxaOrig="5200" w:dyaOrig="700" w14:anchorId="227FD791">
-          <v:shape id="_x0000_i1030" type="#_x0000_t75" style="width:258.75pt;height:35.25pt" o:ole="">
+          <v:shape id="_x0000_i1030" type="#_x0000_t75" style="width:258.5pt;height:35.5pt" o:ole="">
             <v:imagedata r:id="rId26" o:title=""/>
           </v:shape>
-          <o:OLEObject Type="Embed" ProgID="Equation.DSMT4" ShapeID="_x0000_i1030" DrawAspect="Content" ObjectID="_1844883283" r:id="rId27"/>
+          <o:OLEObject Type="Embed" ProgID="Equation.DSMT4" ShapeID="_x0000_i1030" DrawAspect="Content" ObjectID="_1846611388" r:id="rId27"/>
         </w:object>
       </w:r>
     </w:p>
@@ -3399,10 +3399,10 @@
           <w:lang w:val="en-CA"/>
         </w:rPr>
         <w:object w:dxaOrig="2920" w:dyaOrig="380" w14:anchorId="1D7D8C9A">
-          <v:shape id="_x0000_i1031" type="#_x0000_t75" style="width:145.5pt;height:20.25pt" o:ole="">
+          <v:shape id="_x0000_i1031" type="#_x0000_t75" style="width:145.5pt;height:20.5pt" o:ole="">
             <v:imagedata r:id="rId28" o:title=""/>
           </v:shape>
-          <o:OLEObject Type="Embed" ProgID="Equation.DSMT4" ShapeID="_x0000_i1031" DrawAspect="Content" ObjectID="_1844883284" r:id="rId29"/>
+          <o:OLEObject Type="Embed" ProgID="Equation.DSMT4" ShapeID="_x0000_i1031" DrawAspect="Content" ObjectID="_1846611389" r:id="rId29"/>
         </w:object>
       </w:r>
     </w:p>
@@ -4158,10 +4158,10 @@
           <w:position w:val="-14"/>
         </w:rPr>
         <w:object w:dxaOrig="1100" w:dyaOrig="380" w14:anchorId="4CBE8E8E">
-          <v:shape id="_x0000_i1032" type="#_x0000_t75" style="width:56.25pt;height:18.75pt" o:ole="">
+          <v:shape id="_x0000_i1032" type="#_x0000_t75" style="width:56.5pt;height:19pt" o:ole="">
             <v:imagedata r:id="rId34" o:title=""/>
           </v:shape>
-          <o:OLEObject Type="Embed" ProgID="Equation.DSMT4" ShapeID="_x0000_i1032" DrawAspect="Content" ObjectID="_1844883285" r:id="rId35"/>
+          <o:OLEObject Type="Embed" ProgID="Equation.DSMT4" ShapeID="_x0000_i1032" DrawAspect="Content" ObjectID="_1846611390" r:id="rId35"/>
         </w:object>
       </w:r>
       <w:r>
@@ -4210,10 +4210,10 @@
           <w:position w:val="-12"/>
         </w:rPr>
         <w:object w:dxaOrig="380" w:dyaOrig="360" w14:anchorId="2248DB2A">
-          <v:shape id="_x0000_i1033" type="#_x0000_t75" style="width:18.75pt;height:18pt" o:ole="">
+          <v:shape id="_x0000_i1033" type="#_x0000_t75" style="width:19pt;height:18.5pt" o:ole="">
             <v:imagedata r:id="rId36" o:title=""/>
           </v:shape>
-          <o:OLEObject Type="Embed" ProgID="Equation.DSMT4" ShapeID="_x0000_i1033" DrawAspect="Content" ObjectID="_1844883286" r:id="rId37"/>
+          <o:OLEObject Type="Embed" ProgID="Equation.DSMT4" ShapeID="_x0000_i1033" DrawAspect="Content" ObjectID="_1846611391" r:id="rId37"/>
         </w:object>
       </w:r>
       <w:r>
@@ -4287,10 +4287,10 @@
           <w:position w:val="-12"/>
         </w:rPr>
         <w:object w:dxaOrig="320" w:dyaOrig="360" w14:anchorId="78335201">
-          <v:shape id="_x0000_i1034" type="#_x0000_t75" style="width:15.75pt;height:18pt" o:ole="">
+          <v:shape id="_x0000_i1034" type="#_x0000_t75" style="width:15.5pt;height:18.5pt" o:ole="">
             <v:imagedata r:id="rId38" o:title=""/>
           </v:shape>
-          <o:OLEObject Type="Embed" ProgID="Equation.DSMT4" ShapeID="_x0000_i1034" DrawAspect="Content" ObjectID="_1844883287" r:id="rId39"/>
+          <o:OLEObject Type="Embed" ProgID="Equation.DSMT4" ShapeID="_x0000_i1034" DrawAspect="Content" ObjectID="_1846611392" r:id="rId39"/>
         </w:object>
       </w:r>
       <w:r>
@@ -4322,10 +4322,10 @@
           <w:position w:val="-12"/>
         </w:rPr>
         <w:object w:dxaOrig="320" w:dyaOrig="360" w14:anchorId="1E9BF9C5">
-          <v:shape id="_x0000_i1035" type="#_x0000_t75" style="width:15.75pt;height:18pt" o:ole="">
+          <v:shape id="_x0000_i1035" type="#_x0000_t75" style="width:15.5pt;height:18.5pt" o:ole="">
             <v:imagedata r:id="rId40" o:title=""/>
           </v:shape>
-          <o:OLEObject Type="Embed" ProgID="Equation.DSMT4" ShapeID="_x0000_i1035" DrawAspect="Content" ObjectID="_1844883288" r:id="rId41"/>
+          <o:OLEObject Type="Embed" ProgID="Equation.DSMT4" ShapeID="_x0000_i1035" DrawAspect="Content" ObjectID="_1846611393" r:id="rId41"/>
         </w:object>
       </w:r>
       <w:r>
@@ -4339,10 +4339,10 @@
           <w:position w:val="-14"/>
         </w:rPr>
         <w:object w:dxaOrig="520" w:dyaOrig="380" w14:anchorId="4AD08BBC">
-          <v:shape id="_x0000_i1036" type="#_x0000_t75" style="width:26.25pt;height:18.75pt" o:ole="">
+          <v:shape id="_x0000_i1036" type="#_x0000_t75" style="width:26.5pt;height:19pt" o:ole="">
             <v:imagedata r:id="rId42" o:title=""/>
           </v:shape>
-          <o:OLEObject Type="Embed" ProgID="Equation.DSMT4" ShapeID="_x0000_i1036" DrawAspect="Content" ObjectID="_1844883289" r:id="rId43"/>
+          <o:OLEObject Type="Embed" ProgID="Equation.DSMT4" ShapeID="_x0000_i1036" DrawAspect="Content" ObjectID="_1846611394" r:id="rId43"/>
         </w:object>
       </w:r>
       <w:r>
@@ -4356,10 +4356,10 @@
           <w:position w:val="-14"/>
         </w:rPr>
         <w:object w:dxaOrig="360" w:dyaOrig="380" w14:anchorId="7356077E">
-          <v:shape id="_x0000_i1037" type="#_x0000_t75" style="width:18pt;height:18.75pt" o:ole="">
+          <v:shape id="_x0000_i1037" type="#_x0000_t75" style="width:18.5pt;height:19pt" o:ole="">
             <v:imagedata r:id="rId44" o:title=""/>
           </v:shape>
-          <o:OLEObject Type="Embed" ProgID="Equation.DSMT4" ShapeID="_x0000_i1037" DrawAspect="Content" ObjectID="_1844883290" r:id="rId45"/>
+          <o:OLEObject Type="Embed" ProgID="Equation.DSMT4" ShapeID="_x0000_i1037" DrawAspect="Content" ObjectID="_1846611395" r:id="rId45"/>
         </w:object>
       </w:r>
       <w:r>
@@ -4460,10 +4460,10 @@
                 <w:position w:val="-32"/>
               </w:rPr>
               <w:object w:dxaOrig="1660" w:dyaOrig="740" w14:anchorId="381ABF7B">
-                <v:shape id="_x0000_i1038" type="#_x0000_t75" style="width:83.25pt;height:36.75pt" o:ole="">
+                <v:shape id="_x0000_i1038" type="#_x0000_t75" style="width:83.5pt;height:36.5pt" o:ole="">
                   <v:imagedata r:id="rId46" o:title=""/>
                 </v:shape>
-                <o:OLEObject Type="Embed" ProgID="Equation.DSMT4" ShapeID="_x0000_i1038" DrawAspect="Content" ObjectID="_1844883291" r:id="rId47"/>
+                <o:OLEObject Type="Embed" ProgID="Equation.DSMT4" ShapeID="_x0000_i1038" DrawAspect="Content" ObjectID="_1846611396" r:id="rId47"/>
               </w:object>
             </w:r>
           </w:p>
@@ -4746,6 +4746,13 @@
     </w:p>
     <w:p>
       <w:pPr>
+        <w:rPr>
+          <w:lang w:val="en-CA"/>
+        </w:rPr>
+      </w:pPr>
+    </w:p>
+    <w:p>
+      <w:pPr>
         <w:pStyle w:val="2"/>
         <w:jc w:val="both"/>
       </w:pPr>
@@ -4795,10 +4802,10 @@
           <w:position w:val="-14"/>
         </w:rPr>
         <w:object w:dxaOrig="1100" w:dyaOrig="380" w14:anchorId="2024C4D6">
-          <v:shape id="_x0000_i1039" type="#_x0000_t75" style="width:56.25pt;height:18.75pt" o:ole="">
+          <v:shape id="_x0000_i1039" type="#_x0000_t75" style="width:56.5pt;height:19pt" o:ole="">
             <v:imagedata r:id="rId34" o:title=""/>
           </v:shape>
-          <o:OLEObject Type="Embed" ProgID="Equation.DSMT4" ShapeID="_x0000_i1039" DrawAspect="Content" ObjectID="_1844883292" r:id="rId49"/>
+          <o:OLEObject Type="Embed" ProgID="Equation.DSMT4" ShapeID="_x0000_i1039" DrawAspect="Content" ObjectID="_1846611397" r:id="rId49"/>
         </w:object>
       </w:r>
       <w:r>
@@ -4812,10 +4819,10 @@
           <w:position w:val="-14"/>
         </w:rPr>
         <w:object w:dxaOrig="3340" w:dyaOrig="380" w14:anchorId="45DB1B24">
-          <v:shape id="_x0000_i1040" type="#_x0000_t75" style="width:167.25pt;height:18.75pt" o:ole="">
+          <v:shape id="_x0000_i1040" type="#_x0000_t75" style="width:167pt;height:19pt" o:ole="">
             <v:imagedata r:id="rId50" o:title=""/>
           </v:shape>
-          <o:OLEObject Type="Embed" ProgID="Equation.DSMT4" ShapeID="_x0000_i1040" DrawAspect="Content" ObjectID="_1844883293" r:id="rId51"/>
+          <o:OLEObject Type="Embed" ProgID="Equation.DSMT4" ShapeID="_x0000_i1040" DrawAspect="Content" ObjectID="_1846611398" r:id="rId51"/>
         </w:object>
       </w:r>
       <w:r>
@@ -4841,7 +4848,7 @@
           <v:shape id="_x0000_i1041" type="#_x0000_t75" style="width:12pt;height:10.5pt" o:ole="">
             <v:imagedata r:id="rId21" o:title=""/>
           </v:shape>
-          <o:OLEObject Type="Embed" ProgID="Equation.DSMT4" ShapeID="_x0000_i1041" DrawAspect="Content" ObjectID="_1844883294" r:id="rId52"/>
+          <o:OLEObject Type="Embed" ProgID="Equation.DSMT4" ShapeID="_x0000_i1041" DrawAspect="Content" ObjectID="_1846611399" r:id="rId52"/>
         </w:object>
       </w:r>
       <w:r>
@@ -4858,7 +4865,7 @@
           <v:shape id="_x0000_i1042" type="#_x0000_t75" style="width:10.5pt;height:12pt" o:ole="">
             <v:imagedata r:id="rId23" o:title=""/>
           </v:shape>
-          <o:OLEObject Type="Embed" ProgID="Equation.DSMT4" ShapeID="_x0000_i1042" DrawAspect="Content" ObjectID="_1844883295" r:id="rId53"/>
+          <o:OLEObject Type="Embed" ProgID="Equation.DSMT4" ShapeID="_x0000_i1042" DrawAspect="Content" ObjectID="_1846611400" r:id="rId53"/>
         </w:object>
       </w:r>
       <w:r>
@@ -5405,6 +5412,121 @@
     </w:tbl>
     <w:p>
       <w:pPr>
+        <w:overflowPunct w:val="0"/>
+      </w:pPr>
+      <w:r>
+        <w:rPr>
+          <w:rFonts w:hint="eastAsia"/>
+        </w:rPr>
+        <w:lastRenderedPageBreak/>
+        <w:t>目標擬合度</w:t>
+      </w:r>
+    </w:p>
+    <w:tbl>
+      <w:tblPr>
+        <w:tblStyle w:val="af2"/>
+        <w:tblW w:w="0" w:type="auto"/>
+        <w:tblBorders>
+          <w:top w:val="none" w:sz="0" w:space="0" w:color="auto"/>
+          <w:left w:val="none" w:sz="0" w:space="0" w:color="auto"/>
+          <w:bottom w:val="none" w:sz="0" w:space="0" w:color="auto"/>
+          <w:right w:val="none" w:sz="0" w:space="0" w:color="auto"/>
+          <w:insideH w:val="none" w:sz="0" w:space="0" w:color="auto"/>
+          <w:insideV w:val="none" w:sz="0" w:space="0" w:color="auto"/>
+        </w:tblBorders>
+        <w:tblLook w:val="04A0" w:firstRow="1" w:lastRow="0" w:firstColumn="1" w:lastColumn="0" w:noHBand="0" w:noVBand="1"/>
+      </w:tblPr>
+      <w:tblGrid>
+        <w:gridCol w:w="7410"/>
+        <w:gridCol w:w="896"/>
+      </w:tblGrid>
+      <w:tr>
+        <w:tc>
+          <w:tcPr>
+            <w:tcW w:w="7508" w:type="dxa"/>
+            <w:vAlign w:val="center"/>
+          </w:tcPr>
+          <w:p>
+            <w:pPr>
+              <w:spacing w:after="160" w:line="278" w:lineRule="auto"/>
+              <w:ind w:firstLine="400"/>
+              <w:jc w:val="center"/>
+            </w:pPr>
+            <w:r>
+              <w:object w:dxaOrig="2860" w:dyaOrig="639" w14:anchorId="423F7916">
+                <v:shape id="_x0000_i1103" type="#_x0000_t75" style="width:143pt;height:31.5pt" o:ole="">
+                  <v:imagedata r:id="rId54" o:title=""/>
+                </v:shape>
+                <o:OLEObject Type="Embed" ProgID="Equation.DSMT4" ShapeID="_x0000_i1103" DrawAspect="Content" ObjectID="_1846611401" r:id="rId55"/>
+              </w:object>
+            </w:r>
+          </w:p>
+        </w:tc>
+        <w:tc>
+          <w:tcPr>
+            <w:tcW w:w="788" w:type="dxa"/>
+            <w:vAlign w:val="center"/>
+          </w:tcPr>
+          <w:p>
+            <w:pPr>
+              <w:ind w:firstLine="400"/>
+              <w:jc w:val="right"/>
+            </w:pPr>
+            <w:r>
+              <w:rPr>
+                <w:rFonts w:hint="eastAsia"/>
+              </w:rPr>
+              <w:t>(</w:t>
+            </w:r>
+            <w:r>
+              <w:fldChar w:fldCharType="begin"/>
+            </w:r>
+            <w:r>
+              <w:instrText xml:space="preserve"> SEQ </w:instrText>
+            </w:r>
+            <w:r>
+              <w:instrText>方程式</w:instrText>
+            </w:r>
+            <w:r>
+              <w:instrText xml:space="preserve"> \* ARABIC </w:instrText>
+            </w:r>
+            <w:r>
+              <w:fldChar w:fldCharType="separate"/>
+            </w:r>
+            <w:r>
+              <w:rPr>
+                <w:noProof/>
+              </w:rPr>
+              <w:t>3</w:t>
+            </w:r>
+            <w:r>
+              <w:fldChar w:fldCharType="end"/>
+            </w:r>
+            <w:r>
+              <w:rPr>
+                <w:rFonts w:hint="eastAsia"/>
+              </w:rPr>
+              <w:t>)</w:t>
+            </w:r>
+          </w:p>
+        </w:tc>
+      </w:tr>
+    </w:tbl>
+    <w:p>
+      <w:pPr>
+        <w:overflowPunct w:val="0"/>
+      </w:pPr>
+    </w:p>
+    <w:p>
+      <w:pPr>
+        <w:overflowPunct w:val="0"/>
+      </w:pPr>
+      <w:r>
+        <w:t>需求帶覆蓋率</w:t>
+      </w:r>
+    </w:p>
+    <w:p>
+      <w:pPr>
         <w:widowControl/>
         <w:rPr>
           <w:iCs/>
@@ -5412,12 +5534,335 @@
         </w:rPr>
       </w:pPr>
     </w:p>
+    <w:tbl>
+      <w:tblPr>
+        <w:tblStyle w:val="af2"/>
+        <w:tblW w:w="0" w:type="auto"/>
+        <w:tblBorders>
+          <w:top w:val="none" w:sz="0" w:space="0" w:color="auto"/>
+          <w:left w:val="none" w:sz="0" w:space="0" w:color="auto"/>
+          <w:bottom w:val="none" w:sz="0" w:space="0" w:color="auto"/>
+          <w:right w:val="none" w:sz="0" w:space="0" w:color="auto"/>
+          <w:insideH w:val="none" w:sz="0" w:space="0" w:color="auto"/>
+          <w:insideV w:val="none" w:sz="0" w:space="0" w:color="auto"/>
+        </w:tblBorders>
+        <w:tblLook w:val="04A0" w:firstRow="1" w:lastRow="0" w:firstColumn="1" w:lastColumn="0" w:noHBand="0" w:noVBand="1"/>
+      </w:tblPr>
+      <w:tblGrid>
+        <w:gridCol w:w="7410"/>
+        <w:gridCol w:w="896"/>
+      </w:tblGrid>
+      <w:tr>
+        <w:tc>
+          <w:tcPr>
+            <w:tcW w:w="7508" w:type="dxa"/>
+            <w:vAlign w:val="center"/>
+          </w:tcPr>
+          <w:p>
+            <w:pPr>
+              <w:spacing w:after="160" w:line="278" w:lineRule="auto"/>
+              <w:ind w:firstLine="400"/>
+              <w:jc w:val="center"/>
+            </w:pPr>
+            <w:r>
+              <w:rPr>
+                <w:rFonts w:hint="eastAsia"/>
+              </w:rPr>
+              <w:t xml:space="preserve"> </w:t>
+            </w:r>
+            <w:r>
+              <w:rPr>
+                <w:position w:val="-30"/>
+              </w:rPr>
+              <w:object w:dxaOrig="6480" w:dyaOrig="700" w14:anchorId="2308A228">
+                <v:shape id="_x0000_i1043" type="#_x0000_t75" style="width:324pt;height:35pt" o:ole="">
+                  <v:imagedata r:id="rId56" o:title=""/>
+                </v:shape>
+                <o:OLEObject Type="Embed" ProgID="Equation.DSMT4" ShapeID="_x0000_i1043" DrawAspect="Content" ObjectID="_1846611402" r:id="rId57"/>
+              </w:object>
+            </w:r>
+          </w:p>
+        </w:tc>
+        <w:tc>
+          <w:tcPr>
+            <w:tcW w:w="788" w:type="dxa"/>
+            <w:vAlign w:val="center"/>
+          </w:tcPr>
+          <w:p>
+            <w:pPr>
+              <w:ind w:firstLine="400"/>
+              <w:jc w:val="right"/>
+            </w:pPr>
+            <w:r>
+              <w:rPr>
+                <w:rFonts w:hint="eastAsia"/>
+              </w:rPr>
+              <w:t>(</w:t>
+            </w:r>
+            <w:r>
+              <w:fldChar w:fldCharType="begin"/>
+            </w:r>
+            <w:r>
+              <w:instrText xml:space="preserve"> SEQ </w:instrText>
+            </w:r>
+            <w:r>
+              <w:instrText>方程式</w:instrText>
+            </w:r>
+            <w:r>
+              <w:instrText xml:space="preserve"> \* ARABIC </w:instrText>
+            </w:r>
+            <w:r>
+              <w:fldChar w:fldCharType="separate"/>
+            </w:r>
+            <w:r>
+              <w:rPr>
+                <w:noProof/>
+              </w:rPr>
+              <w:t>4</w:t>
+            </w:r>
+            <w:r>
+              <w:fldChar w:fldCharType="end"/>
+            </w:r>
+            <w:r>
+              <w:rPr>
+                <w:rFonts w:hint="eastAsia"/>
+              </w:rPr>
+              <w:t>)</w:t>
+            </w:r>
+          </w:p>
+        </w:tc>
+      </w:tr>
+    </w:tbl>
     <w:p>
       <w:pPr>
+        <w:overflowPunct w:val="0"/>
+        <w:rPr>
+          <w:rFonts w:hint="eastAsia"/>
+        </w:rPr>
+      </w:pPr>
+    </w:p>
+    <w:p>
+      <w:pPr>
+        <w:overflowPunct w:val="0"/>
+      </w:pPr>
+      <w:r>
+        <w:rPr>
+          <w:rFonts w:hint="eastAsia"/>
+        </w:rPr>
+        <w:t>遲滯效應量</w:t>
+      </w:r>
+    </w:p>
+    <w:tbl>
+      <w:tblPr>
+        <w:tblStyle w:val="af2"/>
+        <w:tblW w:w="0" w:type="auto"/>
+        <w:tblBorders>
+          <w:top w:val="none" w:sz="0" w:space="0" w:color="auto"/>
+          <w:left w:val="none" w:sz="0" w:space="0" w:color="auto"/>
+          <w:bottom w:val="none" w:sz="0" w:space="0" w:color="auto"/>
+          <w:right w:val="none" w:sz="0" w:space="0" w:color="auto"/>
+          <w:insideH w:val="none" w:sz="0" w:space="0" w:color="auto"/>
+          <w:insideV w:val="none" w:sz="0" w:space="0" w:color="auto"/>
+        </w:tblBorders>
+        <w:tblLook w:val="04A0" w:firstRow="1" w:lastRow="0" w:firstColumn="1" w:lastColumn="0" w:noHBand="0" w:noVBand="1"/>
+      </w:tblPr>
+      <w:tblGrid>
+        <w:gridCol w:w="7410"/>
+        <w:gridCol w:w="896"/>
+      </w:tblGrid>
+      <w:tr>
+        <w:tc>
+          <w:tcPr>
+            <w:tcW w:w="7508" w:type="dxa"/>
+            <w:vAlign w:val="center"/>
+          </w:tcPr>
+          <w:p>
+            <w:pPr>
+              <w:spacing w:after="160" w:line="278" w:lineRule="auto"/>
+              <w:ind w:firstLine="400"/>
+              <w:jc w:val="center"/>
+            </w:pPr>
+            <w:r>
+              <w:rPr>
+                <w:position w:val="-18"/>
+              </w:rPr>
+              <w:object w:dxaOrig="2620" w:dyaOrig="460" w14:anchorId="6EB93471">
+                <v:shape id="_x0000_i1110" type="#_x0000_t75" style="width:130.5pt;height:23.5pt" o:ole="">
+                  <v:imagedata r:id="rId58" o:title=""/>
+                </v:shape>
+                <o:OLEObject Type="Embed" ProgID="Equation.DSMT4" ShapeID="_x0000_i1110" DrawAspect="Content" ObjectID="_1846611403" r:id="rId59"/>
+              </w:object>
+            </w:r>
+          </w:p>
+        </w:tc>
+        <w:tc>
+          <w:tcPr>
+            <w:tcW w:w="788" w:type="dxa"/>
+            <w:vAlign w:val="center"/>
+          </w:tcPr>
+          <w:p>
+            <w:pPr>
+              <w:ind w:firstLine="400"/>
+              <w:jc w:val="right"/>
+            </w:pPr>
+            <w:r>
+              <w:rPr>
+                <w:rFonts w:hint="eastAsia"/>
+              </w:rPr>
+              <w:t>(</w:t>
+            </w:r>
+            <w:r>
+              <w:fldChar w:fldCharType="begin"/>
+            </w:r>
+            <w:r>
+              <w:instrText xml:space="preserve"> SEQ </w:instrText>
+            </w:r>
+            <w:r>
+              <w:instrText>方程式</w:instrText>
+            </w:r>
+            <w:r>
+              <w:instrText xml:space="preserve"> \* ARABIC </w:instrText>
+            </w:r>
+            <w:r>
+              <w:fldChar w:fldCharType="separate"/>
+            </w:r>
+            <w:r>
+              <w:rPr>
+                <w:noProof/>
+              </w:rPr>
+              <w:t>5</w:t>
+            </w:r>
+            <w:r>
+              <w:fldChar w:fldCharType="end"/>
+            </w:r>
+            <w:r>
+              <w:rPr>
+                <w:rFonts w:hint="eastAsia"/>
+              </w:rPr>
+              <w:t>)</w:t>
+            </w:r>
+          </w:p>
+        </w:tc>
+      </w:tr>
+    </w:tbl>
+    <w:p>
+      <w:pPr>
+        <w:overflowPunct w:val="0"/>
+        <w:rPr>
+          <w:rFonts w:hint="eastAsia"/>
+        </w:rPr>
+      </w:pPr>
+    </w:p>
+    <w:p>
+      <w:pPr>
+        <w:overflowPunct w:val="0"/>
+      </w:pPr>
+      <w:r>
+        <w:rPr>
+          <w:rFonts w:hint="eastAsia"/>
+        </w:rPr>
+        <w:t>退場偏移扭矩</w:t>
+      </w:r>
+    </w:p>
+    <w:tbl>
+      <w:tblPr>
+        <w:tblStyle w:val="af2"/>
+        <w:tblW w:w="0" w:type="auto"/>
+        <w:tblBorders>
+          <w:top w:val="none" w:sz="0" w:space="0" w:color="auto"/>
+          <w:left w:val="none" w:sz="0" w:space="0" w:color="auto"/>
+          <w:bottom w:val="none" w:sz="0" w:space="0" w:color="auto"/>
+          <w:right w:val="none" w:sz="0" w:space="0" w:color="auto"/>
+          <w:insideH w:val="none" w:sz="0" w:space="0" w:color="auto"/>
+          <w:insideV w:val="none" w:sz="0" w:space="0" w:color="auto"/>
+        </w:tblBorders>
+        <w:tblLook w:val="04A0" w:firstRow="1" w:lastRow="0" w:firstColumn="1" w:lastColumn="0" w:noHBand="0" w:noVBand="1"/>
+      </w:tblPr>
+      <w:tblGrid>
+        <w:gridCol w:w="7410"/>
+        <w:gridCol w:w="896"/>
+      </w:tblGrid>
+      <w:tr>
+        <w:tc>
+          <w:tcPr>
+            <w:tcW w:w="7508" w:type="dxa"/>
+            <w:vAlign w:val="center"/>
+          </w:tcPr>
+          <w:p>
+            <w:pPr>
+              <w:spacing w:after="160" w:line="278" w:lineRule="auto"/>
+              <w:ind w:firstLine="400"/>
+              <w:jc w:val="center"/>
+            </w:pPr>
+            <w:r>
+              <w:rPr>
+                <w:position w:val="-12"/>
+              </w:rPr>
+              <w:object w:dxaOrig="2160" w:dyaOrig="340" w14:anchorId="4A9FEAAE">
+                <v:shape id="_x0000_i1115" type="#_x0000_t75" style="width:108pt;height:17pt" o:ole="">
+                  <v:imagedata r:id="rId60" o:title=""/>
+                </v:shape>
+                <o:OLEObject Type="Embed" ProgID="Equation.DSMT4" ShapeID="_x0000_i1115" DrawAspect="Content" ObjectID="_1846611404" r:id="rId61"/>
+              </w:object>
+            </w:r>
+          </w:p>
+        </w:tc>
+        <w:tc>
+          <w:tcPr>
+            <w:tcW w:w="788" w:type="dxa"/>
+            <w:vAlign w:val="center"/>
+          </w:tcPr>
+          <w:p>
+            <w:pPr>
+              <w:ind w:firstLine="400"/>
+              <w:jc w:val="right"/>
+            </w:pPr>
+            <w:r>
+              <w:rPr>
+                <w:rFonts w:hint="eastAsia"/>
+              </w:rPr>
+              <w:t>(</w:t>
+            </w:r>
+            <w:r>
+              <w:fldChar w:fldCharType="begin"/>
+            </w:r>
+            <w:r>
+              <w:instrText xml:space="preserve"> SEQ </w:instrText>
+            </w:r>
+            <w:r>
+              <w:instrText>方程式</w:instrText>
+            </w:r>
+            <w:r>
+              <w:instrText xml:space="preserve"> \* ARABIC </w:instrText>
+            </w:r>
+            <w:r>
+              <w:fldChar w:fldCharType="separate"/>
+            </w:r>
+            <w:r>
+              <w:rPr>
+                <w:noProof/>
+              </w:rPr>
+              <w:t>6</w:t>
+            </w:r>
+            <w:r>
+              <w:fldChar w:fldCharType="end"/>
+            </w:r>
+            <w:r>
+              <w:rPr>
+                <w:rFonts w:hint="eastAsia"/>
+              </w:rPr>
+              <w:t>)</w:t>
+            </w:r>
+          </w:p>
+        </w:tc>
+      </w:tr>
+    </w:tbl>
+    <w:p>
+      <w:pPr>
         <w:jc w:val="both"/>
         <w:rPr>
+          <w:rFonts w:hint="eastAsia"/>
           <w:iCs/>
-          <w:lang w:val="en-CA"/>
         </w:rPr>
       </w:pPr>
     </w:p>
@@ -5522,10 +5967,10 @@
           <w:lang w:val="en-CA"/>
         </w:rPr>
         <w:object w:dxaOrig="1100" w:dyaOrig="279" w14:anchorId="0AD38B19">
-          <v:shape id="_x0000_i1043" type="#_x0000_t75" style="width:54pt;height:14.25pt" o:ole="">
-            <v:imagedata r:id="rId54" o:title=""/>
+          <v:shape id="_x0000_i1044" type="#_x0000_t75" style="width:54pt;height:14.5pt" o:ole="">
+            <v:imagedata r:id="rId62" o:title=""/>
           </v:shape>
-          <o:OLEObject Type="Embed" ProgID="Equation.DSMT4" ShapeID="_x0000_i1043" DrawAspect="Content" ObjectID="_1844883296" r:id="rId55"/>
+          <o:OLEObject Type="Embed" ProgID="Equation.DSMT4" ShapeID="_x0000_i1044" DrawAspect="Content" ObjectID="_1846611405" r:id="rId63"/>
         </w:object>
       </w:r>
     </w:p>
@@ -6976,6 +7421,7 @@
                 <w:rFonts w:hint="eastAsia"/>
                 <w:lang w:val="en-CA"/>
               </w:rPr>
+              <w:lastRenderedPageBreak/>
               <w:t>磁石</w:t>
             </w:r>
           </w:p>
@@ -9098,8 +9544,8 @@
         <w:tblLook w:val="04A0" w:firstRow="1" w:lastRow="0" w:firstColumn="1" w:lastColumn="0" w:noHBand="0" w:noVBand="1"/>
       </w:tblPr>
       <w:tblGrid>
-        <w:gridCol w:w="3952"/>
-        <w:gridCol w:w="4344"/>
+        <w:gridCol w:w="3948"/>
+        <w:gridCol w:w="4348"/>
       </w:tblGrid>
       <w:tr>
         <w:tc>
@@ -9170,10 +9616,10 @@
                 <w:position w:val="-14"/>
               </w:rPr>
               <w:object w:dxaOrig="1060" w:dyaOrig="380" w14:anchorId="1534179E">
-                <v:shape id="_x0000_i1044" type="#_x0000_t75" style="width:53.25pt;height:18.75pt" o:ole="">
-                  <v:imagedata r:id="rId56" o:title=""/>
+                <v:shape id="_x0000_i1045" type="#_x0000_t75" style="width:53pt;height:19pt" o:ole="">
+                  <v:imagedata r:id="rId64" o:title=""/>
                 </v:shape>
-                <o:OLEObject Type="Embed" ProgID="Equation.DSMT4" ShapeID="_x0000_i1044" DrawAspect="Content" ObjectID="_1844883297" r:id="rId57"/>
+                <o:OLEObject Type="Embed" ProgID="Equation.DSMT4" ShapeID="_x0000_i1045" DrawAspect="Content" ObjectID="_1846611406" r:id="rId65"/>
               </w:object>
             </w:r>
           </w:p>
@@ -9212,10 +9658,10 @@
                 <w:position w:val="-14"/>
               </w:rPr>
               <w:object w:dxaOrig="740" w:dyaOrig="380" w14:anchorId="0A7AD222">
-                <v:shape id="_x0000_i1045" type="#_x0000_t75" style="width:36.75pt;height:18.75pt" o:ole="">
-                  <v:imagedata r:id="rId58" o:title=""/>
+                <v:shape id="_x0000_i1046" type="#_x0000_t75" style="width:36.5pt;height:19pt" o:ole="">
+                  <v:imagedata r:id="rId66" o:title=""/>
                 </v:shape>
-                <o:OLEObject Type="Embed" ProgID="Equation.DSMT4" ShapeID="_x0000_i1045" DrawAspect="Content" ObjectID="_1844883298" r:id="rId59"/>
+                <o:OLEObject Type="Embed" ProgID="Equation.DSMT4" ShapeID="_x0000_i1046" DrawAspect="Content" ObjectID="_1846611407" r:id="rId67"/>
               </w:object>
             </w:r>
           </w:p>
@@ -9260,10 +9706,10 @@
                 <w:lang w:val="en-CA"/>
               </w:rPr>
               <w:object w:dxaOrig="960" w:dyaOrig="760" w14:anchorId="24DC0BA4">
-                <v:shape id="_x0000_i1046" type="#_x0000_t75" style="width:48pt;height:38.25pt" o:ole="">
-                  <v:imagedata r:id="rId60" o:title=""/>
+                <v:shape id="_x0000_i1047" type="#_x0000_t75" style="width:48pt;height:38pt" o:ole="">
+                  <v:imagedata r:id="rId68" o:title=""/>
                 </v:shape>
-                <o:OLEObject Type="Embed" ProgID="Equation.DSMT4" ShapeID="_x0000_i1046" DrawAspect="Content" ObjectID="_1844883299" r:id="rId61"/>
+                <o:OLEObject Type="Embed" ProgID="Equation.DSMT4" ShapeID="_x0000_i1047" DrawAspect="Content" ObjectID="_1846611408" r:id="rId69"/>
               </w:object>
             </w:r>
           </w:p>
@@ -9289,7 +9735,6 @@
                 <w:iCs/>
                 <w:lang w:val="en-CA"/>
               </w:rPr>
-              <w:lastRenderedPageBreak/>
               <w:t>物理合理性</w:t>
             </w:r>
             <w:r>
@@ -9320,10 +9765,10 @@
                 <w:lang w:val="en-CA"/>
               </w:rPr>
               <w:object w:dxaOrig="2659" w:dyaOrig="1420" w14:anchorId="28B74947">
-                <v:shape id="_x0000_i1047" type="#_x0000_t75" style="width:132.75pt;height:71.25pt" o:ole="">
-                  <v:imagedata r:id="rId62" o:title=""/>
+                <v:shape id="_x0000_i1048" type="#_x0000_t75" style="width:132.5pt;height:71.5pt" o:ole="">
+                  <v:imagedata r:id="rId70" o:title=""/>
                 </v:shape>
-                <o:OLEObject Type="Embed" ProgID="Equation.DSMT4" ShapeID="_x0000_i1047" DrawAspect="Content" ObjectID="_1844883300" r:id="rId63"/>
+                <o:OLEObject Type="Embed" ProgID="Equation.DSMT4" ShapeID="_x0000_i1048" DrawAspect="Content" ObjectID="_1846611409" r:id="rId71"/>
               </w:object>
             </w:r>
           </w:p>
@@ -9368,10 +9813,10 @@
                 <w:position w:val="-124"/>
               </w:rPr>
               <w:object w:dxaOrig="4140" w:dyaOrig="2600" w14:anchorId="3DB9CF55">
-                <v:shape id="_x0000_i1048" type="#_x0000_t75" style="width:206.25pt;height:129.75pt" o:ole="">
-                  <v:imagedata r:id="rId64" o:title=""/>
+                <v:shape id="_x0000_i1049" type="#_x0000_t75" style="width:206.5pt;height:129.5pt" o:ole="">
+                  <v:imagedata r:id="rId72" o:title=""/>
                 </v:shape>
-                <o:OLEObject Type="Embed" ProgID="Equation.DSMT4" ShapeID="_x0000_i1048" DrawAspect="Content" ObjectID="_1844883301" r:id="rId65"/>
+                <o:OLEObject Type="Embed" ProgID="Equation.DSMT4" ShapeID="_x0000_i1049" DrawAspect="Content" ObjectID="_1846611410" r:id="rId73"/>
               </w:object>
             </w:r>
           </w:p>
@@ -9392,10 +9837,10 @@
           <w:position w:val="-16"/>
         </w:rPr>
         <w:object w:dxaOrig="2780" w:dyaOrig="440" w14:anchorId="5C2001B6">
-          <v:shape id="_x0000_i1049" type="#_x0000_t75" style="width:138pt;height:21.75pt" o:ole="">
-            <v:imagedata r:id="rId66" o:title=""/>
+          <v:shape id="_x0000_i1050" type="#_x0000_t75" style="width:138pt;height:21.5pt" o:ole="">
+            <v:imagedata r:id="rId74" o:title=""/>
           </v:shape>
-          <o:OLEObject Type="Embed" ProgID="Equation.DSMT4" ShapeID="_x0000_i1049" DrawAspect="Content" ObjectID="_1844883302" r:id="rId67"/>
+          <o:OLEObject Type="Embed" ProgID="Equation.DSMT4" ShapeID="_x0000_i1050" DrawAspect="Content" ObjectID="_1846611411" r:id="rId75"/>
         </w:object>
       </w:r>
     </w:p>
@@ -9431,6 +9876,7 @@
               <w:rPr>
                 <w:noProof/>
               </w:rPr>
+              <w:lastRenderedPageBreak/>
               <w:drawing>
                 <wp:inline distT="0" distB="0" distL="0" distR="0" wp14:anchorId="1D2418EC" wp14:editId="5CD43ADE">
                   <wp:extent cx="2398834" cy="2763570"/>
@@ -9447,7 +9893,7 @@
                           <pic:cNvPicPr/>
                         </pic:nvPicPr>
                         <pic:blipFill>
-                          <a:blip r:embed="rId68" cstate="print">
+                          <a:blip r:embed="rId76" cstate="print">
                             <a:extLst>
                               <a:ext uri="{28A0092B-C50C-407E-A947-70E740481C1C}">
                                 <a14:useLocalDpi xmlns:a14="http://schemas.microsoft.com/office/drawing/2010/main" val="0"/>
@@ -9503,7 +9949,7 @@
                           <pic:cNvPicPr/>
                         </pic:nvPicPr>
                         <pic:blipFill>
-                          <a:blip r:embed="rId69" cstate="print">
+                          <a:blip r:embed="rId77" cstate="print">
                             <a:extLst>
                               <a:ext uri="{28A0092B-C50C-407E-A947-70E740481C1C}">
                                 <a14:useLocalDpi xmlns:a14="http://schemas.microsoft.com/office/drawing/2010/main" val="0"/>
@@ -10982,10 +11428,10 @@
                 <w:position w:val="-12"/>
               </w:rPr>
               <w:object w:dxaOrig="220" w:dyaOrig="360" w14:anchorId="1A82F333">
-                <v:shape id="_x0000_i1050" type="#_x0000_t75" style="width:11.25pt;height:18pt" o:ole="">
-                  <v:imagedata r:id="rId70" o:title=""/>
+                <v:shape id="_x0000_i1051" type="#_x0000_t75" style="width:11.5pt;height:18.5pt" o:ole="">
+                  <v:imagedata r:id="rId78" o:title=""/>
                 </v:shape>
-                <o:OLEObject Type="Embed" ProgID="Equation.DSMT4" ShapeID="_x0000_i1050" DrawAspect="Content" ObjectID="_1844883303" r:id="rId71"/>
+                <o:OLEObject Type="Embed" ProgID="Equation.DSMT4" ShapeID="_x0000_i1051" DrawAspect="Content" ObjectID="_1846611412" r:id="rId79"/>
               </w:object>
             </w:r>
           </w:p>
@@ -11025,10 +11471,10 @@
                 <w:position w:val="-10"/>
               </w:rPr>
               <w:object w:dxaOrig="1140" w:dyaOrig="320" w14:anchorId="2CB8AD2B">
-                <v:shape id="_x0000_i1051" type="#_x0000_t75" style="width:57.75pt;height:15.75pt" o:ole="">
-                  <v:imagedata r:id="rId72" o:title=""/>
+                <v:shape id="_x0000_i1052" type="#_x0000_t75" style="width:57.5pt;height:15.5pt" o:ole="">
+                  <v:imagedata r:id="rId80" o:title=""/>
                 </v:shape>
-                <o:OLEObject Type="Embed" ProgID="Equation.DSMT4" ShapeID="_x0000_i1051" DrawAspect="Content" ObjectID="_1844883304" r:id="rId73"/>
+                <o:OLEObject Type="Embed" ProgID="Equation.DSMT4" ShapeID="_x0000_i1052" DrawAspect="Content" ObjectID="_1846611413" r:id="rId81"/>
               </w:object>
             </w:r>
           </w:p>
@@ -11090,10 +11536,10 @@
                 <w:position w:val="-6"/>
               </w:rPr>
               <w:object w:dxaOrig="200" w:dyaOrig="279" w14:anchorId="057115D2">
-                <v:shape id="_x0000_i1052" type="#_x0000_t75" style="width:10.5pt;height:14.25pt" o:ole="">
-                  <v:imagedata r:id="rId74" o:title=""/>
+                <v:shape id="_x0000_i1053" type="#_x0000_t75" style="width:11pt;height:14.5pt" o:ole="">
+                  <v:imagedata r:id="rId82" o:title=""/>
                 </v:shape>
-                <o:OLEObject Type="Embed" ProgID="Equation.DSMT4" ShapeID="_x0000_i1052" DrawAspect="Content" ObjectID="_1844883305" r:id="rId75"/>
+                <o:OLEObject Type="Embed" ProgID="Equation.DSMT4" ShapeID="_x0000_i1053" DrawAspect="Content" ObjectID="_1846611414" r:id="rId83"/>
               </w:object>
             </w:r>
           </w:p>
@@ -11646,10 +12092,10 @@
           <w:position w:val="-12"/>
         </w:rPr>
         <w:object w:dxaOrig="279" w:dyaOrig="360" w14:anchorId="43D80298">
-          <v:shape id="_x0000_i1053" type="#_x0000_t75" style="width:13.5pt;height:18pt" o:ole="">
-            <v:imagedata r:id="rId76" o:title=""/>
+          <v:shape id="_x0000_i1054" type="#_x0000_t75" style="width:13.5pt;height:18.5pt" o:ole="">
+            <v:imagedata r:id="rId84" o:title=""/>
           </v:shape>
-          <o:OLEObject Type="Embed" ProgID="Equation.DSMT4" ShapeID="_x0000_i1053" DrawAspect="Content" ObjectID="_1844883306" r:id="rId77"/>
+          <o:OLEObject Type="Embed" ProgID="Equation.DSMT4" ShapeID="_x0000_i1054" DrawAspect="Content" ObjectID="_1846611415" r:id="rId85"/>
         </w:object>
       </w:r>
       <w:r>
@@ -11666,10 +12112,10 @@
           <w:position w:val="-14"/>
         </w:rPr>
         <w:object w:dxaOrig="580" w:dyaOrig="380" w14:anchorId="50E84EFE">
-          <v:shape id="_x0000_i1054" type="#_x0000_t75" style="width:29.25pt;height:18.75pt" o:ole="">
-            <v:imagedata r:id="rId78" o:title=""/>
+          <v:shape id="_x0000_i1055" type="#_x0000_t75" style="width:29pt;height:19pt" o:ole="">
+            <v:imagedata r:id="rId86" o:title=""/>
           </v:shape>
-          <o:OLEObject Type="Embed" ProgID="Equation.DSMT4" ShapeID="_x0000_i1054" DrawAspect="Content" ObjectID="_1844883307" r:id="rId79"/>
+          <o:OLEObject Type="Embed" ProgID="Equation.DSMT4" ShapeID="_x0000_i1055" DrawAspect="Content" ObjectID="_1846611416" r:id="rId87"/>
         </w:object>
       </w:r>
     </w:p>
@@ -11737,7 +12183,7 @@
         <w:rPr>
           <w:noProof/>
         </w:rPr>
-        <w:t>3</w:t>
+        <w:t>7</w:t>
       </w:r>
       <w:r>
         <w:rPr>
@@ -11776,7 +12222,7 @@
         <w:rPr>
           <w:noProof/>
         </w:rPr>
-        <w:t>4</w:t>
+        <w:t>8</w:t>
       </w:r>
       <w:r>
         <w:rPr>
@@ -12148,7 +12594,7 @@
               <w:rPr>
                 <w:noProof/>
               </w:rPr>
-              <w:t>3</w:t>
+              <w:t>7</w:t>
             </w:r>
             <w:r>
               <w:fldChar w:fldCharType="end"/>
@@ -12523,7 +12969,7 @@
               <w:rPr>
                 <w:noProof/>
               </w:rPr>
-              <w:t>4</w:t>
+              <w:t>8</w:t>
             </w:r>
             <w:r>
               <w:fldChar w:fldCharType="end"/>
@@ -12869,10 +13315,10 @@
           <w:position w:val="-14"/>
         </w:rPr>
         <w:object w:dxaOrig="1140" w:dyaOrig="380" w14:anchorId="0200A3F1">
-          <v:shape id="_x0000_i1055" type="#_x0000_t75" style="width:57pt;height:18.75pt" o:ole="">
-            <v:imagedata r:id="rId80" o:title=""/>
+          <v:shape id="_x0000_i1056" type="#_x0000_t75" style="width:57pt;height:19pt" o:ole="">
+            <v:imagedata r:id="rId88" o:title=""/>
           </v:shape>
-          <o:OLEObject Type="Embed" ProgID="Equation.DSMT4" ShapeID="_x0000_i1055" DrawAspect="Content" ObjectID="_1844883308" r:id="rId81"/>
+          <o:OLEObject Type="Embed" ProgID="Equation.DSMT4" ShapeID="_x0000_i1056" DrawAspect="Content" ObjectID="_1846611417" r:id="rId89"/>
         </w:object>
       </w:r>
       <w:r>
@@ -12898,6 +13344,7 @@
         <w:rPr>
           <w:rFonts w:hint="eastAsia"/>
         </w:rPr>
+        <w:lastRenderedPageBreak/>
         <w:t>渦電流</w:t>
       </w:r>
       <w:r>
@@ -12994,10 +13441,10 @@
           <w:position w:val="-12"/>
         </w:rPr>
         <w:object w:dxaOrig="300" w:dyaOrig="360" w14:anchorId="0E4308F4">
-          <v:shape id="_x0000_i1056" type="#_x0000_t75" style="width:15pt;height:18pt" o:ole="">
-            <v:imagedata r:id="rId82" o:title=""/>
+          <v:shape id="_x0000_i1057" type="#_x0000_t75" style="width:15pt;height:18.5pt" o:ole="">
+            <v:imagedata r:id="rId90" o:title=""/>
           </v:shape>
-          <o:OLEObject Type="Embed" ProgID="Equation.DSMT4" ShapeID="_x0000_i1056" DrawAspect="Content" ObjectID="_1844883309" r:id="rId83"/>
+          <o:OLEObject Type="Embed" ProgID="Equation.DSMT4" ShapeID="_x0000_i1057" DrawAspect="Content" ObjectID="_1846611418" r:id="rId91"/>
         </w:object>
       </w:r>
       <w:r>
@@ -13078,10 +13525,10 @@
           <w:lang w:val="en-CA"/>
         </w:rPr>
         <w:object w:dxaOrig="300" w:dyaOrig="360" w14:anchorId="5B1A89B0">
-          <v:shape id="_x0000_i1057" type="#_x0000_t75" style="width:15pt;height:18pt" o:ole="">
-            <v:imagedata r:id="rId84" o:title=""/>
+          <v:shape id="_x0000_i1058" type="#_x0000_t75" style="width:15pt;height:18.5pt" o:ole="">
+            <v:imagedata r:id="rId92" o:title=""/>
           </v:shape>
-          <o:OLEObject Type="Embed" ProgID="Equation.DSMT4" ShapeID="_x0000_i1057" DrawAspect="Content" ObjectID="_1844883310" r:id="rId85"/>
+          <o:OLEObject Type="Embed" ProgID="Equation.DSMT4" ShapeID="_x0000_i1058" DrawAspect="Content" ObjectID="_1846611419" r:id="rId93"/>
         </w:object>
       </w:r>
       <w:r>
@@ -13109,10 +13556,10 @@
           <w:position w:val="-14"/>
         </w:rPr>
         <w:object w:dxaOrig="720" w:dyaOrig="400" w14:anchorId="0197B666">
-          <v:shape id="_x0000_i1058" type="#_x0000_t75" style="width:36.75pt;height:20.25pt" o:ole="">
-            <v:imagedata r:id="rId86" o:title=""/>
+          <v:shape id="_x0000_i1059" type="#_x0000_t75" style="width:36.5pt;height:20.5pt" o:ole="">
+            <v:imagedata r:id="rId94" o:title=""/>
           </v:shape>
-          <o:OLEObject Type="Embed" ProgID="Equation.DSMT4" ShapeID="_x0000_i1058" DrawAspect="Content" ObjectID="_1844883311" r:id="rId87"/>
+          <o:OLEObject Type="Embed" ProgID="Equation.DSMT4" ShapeID="_x0000_i1059" DrawAspect="Content" ObjectID="_1846611420" r:id="rId95"/>
         </w:object>
       </w:r>
       <w:r>
@@ -13133,10 +13580,10 @@
         </w:rPr>
         <w:object w:dxaOrig="1440" w:dyaOrig="1440" w14:anchorId="2DD6EDC8">
           <v:shape id="_x0000_s2076" type="#_x0000_t75" style="position:absolute;margin-left:127.85pt;margin-top:0;width:159.55pt;height:40.3pt;z-index:251659264">
-            <v:imagedata r:id="rId88" o:title=""/>
+            <v:imagedata r:id="rId96" o:title=""/>
             <w10:wrap type="square" side="left"/>
           </v:shape>
-          <o:OLEObject Type="Embed" ProgID="Equation.DSMT4" ShapeID="_x0000_s2076" DrawAspect="Content" ObjectID="_1844883339" r:id="rId89"/>
+          <o:OLEObject Type="Embed" ProgID="Equation.DSMT4" ShapeID="_x0000_s2076" DrawAspect="Content" ObjectID="_1846611448" r:id="rId97"/>
         </w:object>
       </w:r>
       <w:r>
@@ -13165,10 +13612,10 @@
           <w:position w:val="-12"/>
         </w:rPr>
         <w:object w:dxaOrig="300" w:dyaOrig="360" w14:anchorId="02AB2D16">
-          <v:shape id="_x0000_i1060" type="#_x0000_t75" style="width:15pt;height:18pt" o:ole="">
-            <v:imagedata r:id="rId90" o:title=""/>
+          <v:shape id="_x0000_i1061" type="#_x0000_t75" style="width:15pt;height:18.5pt" o:ole="">
+            <v:imagedata r:id="rId98" o:title=""/>
           </v:shape>
-          <o:OLEObject Type="Embed" ProgID="Equation.DSMT4" ShapeID="_x0000_i1060" DrawAspect="Content" ObjectID="_1844883312" r:id="rId91"/>
+          <o:OLEObject Type="Embed" ProgID="Equation.DSMT4" ShapeID="_x0000_i1061" DrawAspect="Content" ObjectID="_1846611421" r:id="rId99"/>
         </w:object>
       </w:r>
       <w:r>
@@ -13193,10 +13640,10 @@
           <w:lang w:val="en-CA" w:eastAsia="ja-JP"/>
         </w:rPr>
         <w:object w:dxaOrig="1420" w:dyaOrig="400" w14:anchorId="51E203EF">
-          <v:shape id="_x0000_i1061" type="#_x0000_t75" style="width:71.25pt;height:20.25pt" o:ole="">
-            <v:imagedata r:id="rId92" o:title=""/>
+          <v:shape id="_x0000_i1062" type="#_x0000_t75" style="width:71.5pt;height:20.5pt" o:ole="">
+            <v:imagedata r:id="rId100" o:title=""/>
           </v:shape>
-          <o:OLEObject Type="Embed" ProgID="Equation.DSMT4" ShapeID="_x0000_i1061" DrawAspect="Content" ObjectID="_1844883313" r:id="rId93"/>
+          <o:OLEObject Type="Embed" ProgID="Equation.DSMT4" ShapeID="_x0000_i1062" DrawAspect="Content" ObjectID="_1846611422" r:id="rId101"/>
         </w:object>
       </w:r>
     </w:p>
@@ -13227,10 +13674,10 @@
           <w:position w:val="-12"/>
         </w:rPr>
         <w:object w:dxaOrig="460" w:dyaOrig="360" w14:anchorId="6937A4A1">
-          <v:shape id="_x0000_i1062" type="#_x0000_t75" style="width:24pt;height:18pt" o:ole="">
-            <v:imagedata r:id="rId94" o:title=""/>
+          <v:shape id="_x0000_i1063" type="#_x0000_t75" style="width:24pt;height:18.5pt" o:ole="">
+            <v:imagedata r:id="rId102" o:title=""/>
           </v:shape>
-          <o:OLEObject Type="Embed" ProgID="Equation.DSMT4" ShapeID="_x0000_i1062" DrawAspect="Content" ObjectID="_1844883314" r:id="rId95"/>
+          <o:OLEObject Type="Embed" ProgID="Equation.DSMT4" ShapeID="_x0000_i1063" DrawAspect="Content" ObjectID="_1846611423" r:id="rId103"/>
         </w:object>
       </w:r>
     </w:p>
@@ -13243,10 +13690,10 @@
           <w:position w:val="-32"/>
         </w:rPr>
         <w:object w:dxaOrig="5240" w:dyaOrig="720" w14:anchorId="7E9A67C7">
-          <v:shape id="_x0000_i1063" type="#_x0000_t75" style="width:264pt;height:36.75pt" o:ole="">
-            <v:imagedata r:id="rId96" o:title=""/>
+          <v:shape id="_x0000_i1064" type="#_x0000_t75" style="width:264.5pt;height:36.5pt" o:ole="">
+            <v:imagedata r:id="rId104" o:title=""/>
           </v:shape>
-          <o:OLEObject Type="Embed" ProgID="Equation.DSMT4" ShapeID="_x0000_i1063" DrawAspect="Content" ObjectID="_1844883315" r:id="rId97"/>
+          <o:OLEObject Type="Embed" ProgID="Equation.DSMT4" ShapeID="_x0000_i1064" DrawAspect="Content" ObjectID="_1846611424" r:id="rId105"/>
         </w:object>
       </w:r>
     </w:p>
@@ -13271,10 +13718,10 @@
           <w:position w:val="-12"/>
         </w:rPr>
         <w:object w:dxaOrig="279" w:dyaOrig="360" w14:anchorId="45108477">
-          <v:shape id="_x0000_i1064" type="#_x0000_t75" style="width:14.25pt;height:18pt" o:ole="">
-            <v:imagedata r:id="rId98" o:title=""/>
+          <v:shape id="_x0000_i1065" type="#_x0000_t75" style="width:14.5pt;height:18.5pt" o:ole="">
+            <v:imagedata r:id="rId106" o:title=""/>
           </v:shape>
-          <o:OLEObject Type="Embed" ProgID="Equation.DSMT4" ShapeID="_x0000_i1064" DrawAspect="Content" ObjectID="_1844883316" r:id="rId99"/>
+          <o:OLEObject Type="Embed" ProgID="Equation.DSMT4" ShapeID="_x0000_i1065" DrawAspect="Content" ObjectID="_1846611425" r:id="rId107"/>
         </w:object>
       </w:r>
     </w:p>
@@ -13302,7 +13749,7 @@
                     <pic:cNvPicPr/>
                   </pic:nvPicPr>
                   <pic:blipFill>
-                    <a:blip r:embed="rId100"/>
+                    <a:blip r:embed="rId108"/>
                     <a:stretch>
                       <a:fillRect/>
                     </a:stretch>
@@ -13343,10 +13790,10 @@
           <w:position w:val="-4"/>
         </w:rPr>
         <w:object w:dxaOrig="180" w:dyaOrig="320" w14:anchorId="63BA0373">
-          <v:shape id="_x0000_i1065" type="#_x0000_t75" style="width:9pt;height:15.75pt" o:ole="">
-            <v:imagedata r:id="rId101" o:title=""/>
+          <v:shape id="_x0000_i1066" type="#_x0000_t75" style="width:9pt;height:15.5pt" o:ole="">
+            <v:imagedata r:id="rId109" o:title=""/>
           </v:shape>
-          <o:OLEObject Type="Embed" ProgID="Equation.DSMT4" ShapeID="_x0000_i1065" DrawAspect="Content" ObjectID="_1844883317" r:id="rId102"/>
+          <o:OLEObject Type="Embed" ProgID="Equation.DSMT4" ShapeID="_x0000_i1066" DrawAspect="Content" ObjectID="_1846611426" r:id="rId110"/>
         </w:object>
       </w:r>
     </w:p>
@@ -13378,7 +13825,7 @@
                     <pic:cNvPicPr/>
                   </pic:nvPicPr>
                   <pic:blipFill>
-                    <a:blip r:embed="rId103"/>
+                    <a:blip r:embed="rId111"/>
                     <a:stretch>
                       <a:fillRect/>
                     </a:stretch>
@@ -13412,6 +13859,7 @@
         <w:rPr>
           <w:rFonts w:hint="eastAsia"/>
         </w:rPr>
+        <w:lastRenderedPageBreak/>
         <w:t>加總求扭矩</w:t>
       </w:r>
       <w:r>
@@ -13419,10 +13867,10 @@
           <w:position w:val="-4"/>
         </w:rPr>
         <w:object w:dxaOrig="220" w:dyaOrig="260" w14:anchorId="100CF53C">
-          <v:shape id="_x0000_i1066" type="#_x0000_t75" style="width:11.25pt;height:12pt" o:ole="">
-            <v:imagedata r:id="rId104" o:title=""/>
+          <v:shape id="_x0000_i1067" type="#_x0000_t75" style="width:11.5pt;height:12pt" o:ole="">
+            <v:imagedata r:id="rId112" o:title=""/>
           </v:shape>
-          <o:OLEObject Type="Embed" ProgID="Equation.DSMT4" ShapeID="_x0000_i1066" DrawAspect="Content" ObjectID="_1844883318" r:id="rId105"/>
+          <o:OLEObject Type="Embed" ProgID="Equation.DSMT4" ShapeID="_x0000_i1067" DrawAspect="Content" ObjectID="_1846611427" r:id="rId113"/>
         </w:object>
       </w:r>
     </w:p>
@@ -13454,7 +13902,7 @@
                     <pic:cNvPicPr/>
                   </pic:nvPicPr>
                   <pic:blipFill>
-                    <a:blip r:embed="rId106"/>
+                    <a:blip r:embed="rId114"/>
                     <a:stretch>
                       <a:fillRect/>
                     </a:stretch>
@@ -13533,10 +13981,10 @@
           <w:position w:val="-12"/>
         </w:rPr>
         <w:object w:dxaOrig="740" w:dyaOrig="360" w14:anchorId="575AC8C9">
-          <v:shape id="_x0000_i1067" type="#_x0000_t75" style="width:36.75pt;height:18pt" o:ole="">
-            <v:imagedata r:id="rId107" o:title=""/>
+          <v:shape id="_x0000_i1068" type="#_x0000_t75" style="width:36.5pt;height:18.5pt" o:ole="">
+            <v:imagedata r:id="rId115" o:title=""/>
           </v:shape>
-          <o:OLEObject Type="Embed" ProgID="Equation.DSMT4" ShapeID="_x0000_i1067" DrawAspect="Content" ObjectID="_1844883319" r:id="rId108"/>
+          <o:OLEObject Type="Embed" ProgID="Equation.DSMT4" ShapeID="_x0000_i1068" DrawAspect="Content" ObjectID="_1846611428" r:id="rId116"/>
         </w:object>
       </w:r>
       <w:r>
@@ -13556,10 +14004,10 @@
           <w:position w:val="-12"/>
         </w:rPr>
         <w:object w:dxaOrig="680" w:dyaOrig="360" w14:anchorId="216618D3">
-          <v:shape id="_x0000_i1068" type="#_x0000_t75" style="width:33.75pt;height:18pt" o:ole="">
-            <v:imagedata r:id="rId109" o:title=""/>
+          <v:shape id="_x0000_i1069" type="#_x0000_t75" style="width:34pt;height:18.5pt" o:ole="">
+            <v:imagedata r:id="rId117" o:title=""/>
           </v:shape>
-          <o:OLEObject Type="Embed" ProgID="Equation.DSMT4" ShapeID="_x0000_i1068" DrawAspect="Content" ObjectID="_1844883320" r:id="rId110"/>
+          <o:OLEObject Type="Embed" ProgID="Equation.DSMT4" ShapeID="_x0000_i1069" DrawAspect="Content" ObjectID="_1846611429" r:id="rId118"/>
         </w:object>
       </w:r>
       <w:r>
@@ -13667,10 +14115,10 @@
           <w:lang w:val="en-CA"/>
         </w:rPr>
         <w:object w:dxaOrig="380" w:dyaOrig="360" w14:anchorId="45596AD0">
-          <v:shape id="_x0000_i1069" type="#_x0000_t75" style="width:18.75pt;height:18pt" o:ole="">
-            <v:imagedata r:id="rId111" o:title=""/>
+          <v:shape id="_x0000_i1070" type="#_x0000_t75" style="width:19pt;height:18.5pt" o:ole="">
+            <v:imagedata r:id="rId119" o:title=""/>
           </v:shape>
-          <o:OLEObject Type="Embed" ProgID="Equation.DSMT4" ShapeID="_x0000_i1069" DrawAspect="Content" ObjectID="_1844883321" r:id="rId112"/>
+          <o:OLEObject Type="Embed" ProgID="Equation.DSMT4" ShapeID="_x0000_i1070" DrawAspect="Content" ObjectID="_1846611430" r:id="rId120"/>
         </w:object>
       </w:r>
       <w:r>
@@ -13685,10 +14133,10 @@
           <w:position w:val="-12"/>
         </w:rPr>
         <w:object w:dxaOrig="340" w:dyaOrig="360" w14:anchorId="5C4B5AFE">
-          <v:shape id="_x0000_i1070" type="#_x0000_t75" style="width:18pt;height:18pt" o:ole="">
-            <v:imagedata r:id="rId113" o:title=""/>
+          <v:shape id="_x0000_i1071" type="#_x0000_t75" style="width:18.5pt;height:18.5pt" o:ole="">
+            <v:imagedata r:id="rId121" o:title=""/>
           </v:shape>
-          <o:OLEObject Type="Embed" ProgID="Equation.DSMT4" ShapeID="_x0000_i1070" DrawAspect="Content" ObjectID="_1844883322" r:id="rId114"/>
+          <o:OLEObject Type="Embed" ProgID="Equation.DSMT4" ShapeID="_x0000_i1071" DrawAspect="Content" ObjectID="_1846611431" r:id="rId122"/>
         </w:object>
       </w:r>
     </w:p>
@@ -13716,7 +14164,7 @@
                     <pic:cNvPicPr/>
                   </pic:nvPicPr>
                   <pic:blipFill>
-                    <a:blip r:embed="rId115"/>
+                    <a:blip r:embed="rId123"/>
                     <a:stretch>
                       <a:fillRect/>
                     </a:stretch>
@@ -13745,7 +14193,6 @@
         <w:rPr>
           <w:noProof/>
         </w:rPr>
-        <w:lastRenderedPageBreak/>
         <w:drawing>
           <wp:inline distT="0" distB="0" distL="0" distR="0" wp14:anchorId="0D051F83" wp14:editId="3B40891E">
             <wp:extent cx="2818155" cy="621652"/>
@@ -13762,7 +14209,7 @@
                     <pic:cNvPicPr/>
                   </pic:nvPicPr>
                   <pic:blipFill>
-                    <a:blip r:embed="rId116"/>
+                    <a:blip r:embed="rId124"/>
                     <a:stretch>
                       <a:fillRect/>
                     </a:stretch>
@@ -13801,10 +14248,10 @@
           <w:position w:val="-12"/>
         </w:rPr>
         <w:object w:dxaOrig="960" w:dyaOrig="360" w14:anchorId="15A4D1D6">
-          <v:shape id="_x0000_i1071" type="#_x0000_t75" style="width:48pt;height:18pt" o:ole="">
-            <v:imagedata r:id="rId117" o:title=""/>
+          <v:shape id="_x0000_i1072" type="#_x0000_t75" style="width:48pt;height:18.5pt" o:ole="">
+            <v:imagedata r:id="rId125" o:title=""/>
           </v:shape>
-          <o:OLEObject Type="Embed" ProgID="Equation.DSMT4" ShapeID="_x0000_i1071" DrawAspect="Content" ObjectID="_1844883323" r:id="rId118"/>
+          <o:OLEObject Type="Embed" ProgID="Equation.DSMT4" ShapeID="_x0000_i1072" DrawAspect="Content" ObjectID="_1846611432" r:id="rId126"/>
         </w:object>
       </w:r>
       <w:r>
@@ -13818,10 +14265,10 @@
           <w:position w:val="-14"/>
         </w:rPr>
         <w:object w:dxaOrig="1180" w:dyaOrig="380" w14:anchorId="62AB8581">
-          <v:shape id="_x0000_i1072" type="#_x0000_t75" style="width:59.25pt;height:18.75pt" o:ole="">
-            <v:imagedata r:id="rId119" o:title=""/>
+          <v:shape id="_x0000_i1073" type="#_x0000_t75" style="width:59pt;height:19pt" o:ole="">
+            <v:imagedata r:id="rId127" o:title=""/>
           </v:shape>
-          <o:OLEObject Type="Embed" ProgID="Equation.DSMT4" ShapeID="_x0000_i1072" DrawAspect="Content" ObjectID="_1844883324" r:id="rId120"/>
+          <o:OLEObject Type="Embed" ProgID="Equation.DSMT4" ShapeID="_x0000_i1073" DrawAspect="Content" ObjectID="_1846611433" r:id="rId128"/>
         </w:object>
       </w:r>
       <w:r>
@@ -13855,7 +14302,7 @@
                     <pic:cNvPicPr/>
                   </pic:nvPicPr>
                   <pic:blipFill>
-                    <a:blip r:embed="rId121"/>
+                    <a:blip r:embed="rId129"/>
                     <a:stretch>
                       <a:fillRect/>
                     </a:stretch>
@@ -13946,7 +14393,7 @@
                     <pic:cNvPicPr/>
                   </pic:nvPicPr>
                   <pic:blipFill>
-                    <a:blip r:embed="rId122"/>
+                    <a:blip r:embed="rId130"/>
                     <a:stretch>
                       <a:fillRect/>
                     </a:stretch>
@@ -14008,6 +14455,7 @@
         <w:rPr>
           <w:noProof/>
         </w:rPr>
+        <w:lastRenderedPageBreak/>
         <w:drawing>
           <wp:inline distT="0" distB="0" distL="0" distR="0" wp14:anchorId="627BE506" wp14:editId="01709DA2">
             <wp:extent cx="5274310" cy="551180"/>
@@ -14024,7 +14472,7 @@
                     <pic:cNvPicPr/>
                   </pic:nvPicPr>
                   <pic:blipFill>
-                    <a:blip r:embed="rId123"/>
+                    <a:blip r:embed="rId131"/>
                     <a:stretch>
                       <a:fillRect/>
                     </a:stretch>
@@ -14081,7 +14529,7 @@
                     <pic:cNvPicPr/>
                   </pic:nvPicPr>
                   <pic:blipFill>
-                    <a:blip r:embed="rId124"/>
+                    <a:blip r:embed="rId132"/>
                     <a:stretch>
                       <a:fillRect/>
                     </a:stretch>
@@ -14131,7 +14579,7 @@
                     <pic:cNvPicPr/>
                   </pic:nvPicPr>
                   <pic:blipFill>
-                    <a:blip r:embed="rId125"/>
+                    <a:blip r:embed="rId133"/>
                     <a:stretch>
                       <a:fillRect/>
                     </a:stretch>
@@ -14163,7 +14611,6 @@
           <w:rFonts w:hint="eastAsia"/>
           <w:lang w:val="en-CA"/>
         </w:rPr>
-        <w:lastRenderedPageBreak/>
         <w:t>自調節機構模型</w:t>
       </w:r>
       <w:bookmarkEnd w:id="42"/>
@@ -14293,7 +14740,7 @@
         <w:rPr>
           <w:noProof/>
         </w:rPr>
-        <w:t>5</w:t>
+        <w:t>9</w:t>
       </w:r>
       <w:r>
         <w:rPr>
@@ -14349,10 +14796,10 @@
                 <w:position w:val="-14"/>
               </w:rPr>
               <w:object w:dxaOrig="2260" w:dyaOrig="380" w14:anchorId="5C51C19D">
-                <v:shape id="_x0000_i1073" type="#_x0000_t75" style="width:112.5pt;height:18.75pt" o:ole="">
-                  <v:imagedata r:id="rId126" o:title=""/>
+                <v:shape id="_x0000_i1074" type="#_x0000_t75" style="width:112.5pt;height:19pt" o:ole="">
+                  <v:imagedata r:id="rId134" o:title=""/>
                 </v:shape>
-                <o:OLEObject Type="Embed" ProgID="Equation.DSMT4" ShapeID="_x0000_i1073" DrawAspect="Content" ObjectID="_1844883325" r:id="rId127"/>
+                <o:OLEObject Type="Embed" ProgID="Equation.DSMT4" ShapeID="_x0000_i1074" DrawAspect="Content" ObjectID="_1846611434" r:id="rId135"/>
               </w:object>
             </w:r>
           </w:p>
@@ -14392,7 +14839,7 @@
               <w:rPr>
                 <w:noProof/>
               </w:rPr>
-              <w:t>5</w:t>
+              <w:t>9</w:t>
             </w:r>
             <w:r>
               <w:fldChar w:fldCharType="end"/>
@@ -14427,10 +14874,10 @@
           <w:position w:val="-12"/>
         </w:rPr>
         <w:object w:dxaOrig="279" w:dyaOrig="360" w14:anchorId="013E093B">
-          <v:shape id="_x0000_i1074" type="#_x0000_t75" style="width:13.5pt;height:18pt" o:ole="">
-            <v:imagedata r:id="rId128" o:title=""/>
+          <v:shape id="_x0000_i1075" type="#_x0000_t75" style="width:13.5pt;height:18.5pt" o:ole="">
+            <v:imagedata r:id="rId136" o:title=""/>
           </v:shape>
-          <o:OLEObject Type="Embed" ProgID="Equation.DSMT4" ShapeID="_x0000_i1074" DrawAspect="Content" ObjectID="_1844883326" r:id="rId129"/>
+          <o:OLEObject Type="Embed" ProgID="Equation.DSMT4" ShapeID="_x0000_i1075" DrawAspect="Content" ObjectID="_1846611435" r:id="rId137"/>
         </w:object>
       </w:r>
       <w:r>
@@ -14444,10 +14891,10 @@
           <w:position w:val="-14"/>
         </w:rPr>
         <w:object w:dxaOrig="580" w:dyaOrig="380" w14:anchorId="560685A7">
-          <v:shape id="_x0000_i1075" type="#_x0000_t75" style="width:29.25pt;height:18.75pt" o:ole="">
-            <v:imagedata r:id="rId130" o:title=""/>
+          <v:shape id="_x0000_i1076" type="#_x0000_t75" style="width:29pt;height:19pt" o:ole="">
+            <v:imagedata r:id="rId138" o:title=""/>
           </v:shape>
-          <o:OLEObject Type="Embed" ProgID="Equation.DSMT4" ShapeID="_x0000_i1075" DrawAspect="Content" ObjectID="_1844883327" r:id="rId131"/>
+          <o:OLEObject Type="Embed" ProgID="Equation.DSMT4" ShapeID="_x0000_i1076" DrawAspect="Content" ObjectID="_1846611436" r:id="rId139"/>
         </w:object>
       </w:r>
       <w:r>
@@ -14461,10 +14908,10 @@
           <w:position w:val="-14"/>
         </w:rPr>
         <w:object w:dxaOrig="720" w:dyaOrig="380" w14:anchorId="4FA12021">
-          <v:shape id="_x0000_i1076" type="#_x0000_t75" style="width:36.75pt;height:18.75pt" o:ole="">
-            <v:imagedata r:id="rId132" o:title=""/>
+          <v:shape id="_x0000_i1077" type="#_x0000_t75" style="width:36.5pt;height:19pt" o:ole="">
+            <v:imagedata r:id="rId140" o:title=""/>
           </v:shape>
-          <o:OLEObject Type="Embed" ProgID="Equation.DSMT4" ShapeID="_x0000_i1076" DrawAspect="Content" ObjectID="_1844883328" r:id="rId133"/>
+          <o:OLEObject Type="Embed" ProgID="Equation.DSMT4" ShapeID="_x0000_i1077" DrawAspect="Content" ObjectID="_1846611437" r:id="rId141"/>
         </w:object>
       </w:r>
       <w:r>
@@ -14514,6 +14961,7 @@
                 <w:noProof/>
                 <w:lang w:val="en-CA"/>
               </w:rPr>
+              <w:lastRenderedPageBreak/>
               <w:drawing>
                 <wp:inline distT="0" distB="0" distL="0" distR="0" wp14:anchorId="4294AB1A" wp14:editId="57E0C2E7">
                   <wp:extent cx="1945694" cy="3625794"/>
@@ -14530,7 +14978,7 @@
                           <pic:cNvPicPr/>
                         </pic:nvPicPr>
                         <pic:blipFill>
-                          <a:blip r:embed="rId134" cstate="print">
+                          <a:blip r:embed="rId142" cstate="print">
                             <a:extLst>
                               <a:ext uri="{28A0092B-C50C-407E-A947-70E740481C1C}">
                                 <a14:useLocalDpi xmlns:a14="http://schemas.microsoft.com/office/drawing/2010/main" val="0"/>
@@ -14805,7 +15253,7 @@
         <w:rPr>
           <w:noProof/>
         </w:rPr>
-        <w:t>6</w:t>
+        <w:t>10</w:t>
       </w:r>
       <w:r>
         <w:rPr>
@@ -14886,7 +15334,7 @@
         <w:rPr>
           <w:noProof/>
         </w:rPr>
-        <w:t>7</w:t>
+        <w:t>11</w:t>
       </w:r>
       <w:r>
         <w:rPr>
@@ -14942,10 +15390,10 @@
                 <w:position w:val="-12"/>
               </w:rPr>
               <w:object w:dxaOrig="3460" w:dyaOrig="360" w14:anchorId="40C5A2C7">
-                <v:shape id="_x0000_i1077" type="#_x0000_t75" style="width:173.25pt;height:18pt" o:ole="">
-                  <v:imagedata r:id="rId135" o:title=""/>
+                <v:shape id="_x0000_i1078" type="#_x0000_t75" style="width:173pt;height:18.5pt" o:ole="">
+                  <v:imagedata r:id="rId143" o:title=""/>
                 </v:shape>
-                <o:OLEObject Type="Embed" ProgID="Equation.DSMT4" ShapeID="_x0000_i1077" DrawAspect="Content" ObjectID="_1844883329" r:id="rId136"/>
+                <o:OLEObject Type="Embed" ProgID="Equation.DSMT4" ShapeID="_x0000_i1078" DrawAspect="Content" ObjectID="_1846611438" r:id="rId144"/>
               </w:object>
             </w:r>
           </w:p>
@@ -14985,7 +15433,7 @@
               <w:rPr>
                 <w:noProof/>
               </w:rPr>
-              <w:t>6</w:t>
+              <w:t>10</w:t>
             </w:r>
             <w:r>
               <w:fldChar w:fldCharType="end"/>
@@ -15016,10 +15464,10 @@
                 <w:position w:val="-12"/>
               </w:rPr>
               <w:object w:dxaOrig="4540" w:dyaOrig="380" w14:anchorId="6FD1E4C6">
-                <v:shape id="_x0000_i1078" type="#_x0000_t75" style="width:227.25pt;height:18.75pt" o:ole="">
-                  <v:imagedata r:id="rId137" o:title=""/>
+                <v:shape id="_x0000_i1079" type="#_x0000_t75" style="width:227pt;height:19pt" o:ole="">
+                  <v:imagedata r:id="rId145" o:title=""/>
                 </v:shape>
-                <o:OLEObject Type="Embed" ProgID="Equation.DSMT4" ShapeID="_x0000_i1078" DrawAspect="Content" ObjectID="_1844883330" r:id="rId138"/>
+                <o:OLEObject Type="Embed" ProgID="Equation.DSMT4" ShapeID="_x0000_i1079" DrawAspect="Content" ObjectID="_1846611439" r:id="rId146"/>
               </w:object>
             </w:r>
           </w:p>
@@ -15059,7 +15507,7 @@
               <w:rPr>
                 <w:noProof/>
               </w:rPr>
-              <w:t>7</w:t>
+              <w:t>11</w:t>
             </w:r>
             <w:r>
               <w:fldChar w:fldCharType="end"/>
@@ -15136,7 +15584,7 @@
         <w:rPr>
           <w:noProof/>
         </w:rPr>
-        <w:t>6</w:t>
+        <w:t>10</w:t>
       </w:r>
       <w:r>
         <w:rPr>
@@ -15190,7 +15638,7 @@
         <w:rPr>
           <w:noProof/>
         </w:rPr>
-        <w:t>7</w:t>
+        <w:t>11</w:t>
       </w:r>
       <w:r>
         <w:rPr>
@@ -15271,7 +15719,7 @@
         <w:rPr>
           <w:noProof/>
         </w:rPr>
-        <w:t>8</w:t>
+        <w:t>12</w:t>
       </w:r>
       <w:r>
         <w:rPr>
@@ -15327,10 +15775,10 @@
                 <w:position w:val="-32"/>
               </w:rPr>
               <w:object w:dxaOrig="4980" w:dyaOrig="760" w14:anchorId="7AFD0E2E">
-                <v:shape id="_x0000_i1079" type="#_x0000_t75" style="width:249pt;height:38.25pt" o:ole="">
-                  <v:imagedata r:id="rId139" o:title=""/>
+                <v:shape id="_x0000_i1080" type="#_x0000_t75" style="width:249pt;height:38pt" o:ole="">
+                  <v:imagedata r:id="rId147" o:title=""/>
                 </v:shape>
-                <o:OLEObject Type="Embed" ProgID="Equation.DSMT4" ShapeID="_x0000_i1079" DrawAspect="Content" ObjectID="_1844883331" r:id="rId140"/>
+                <o:OLEObject Type="Embed" ProgID="Equation.DSMT4" ShapeID="_x0000_i1080" DrawAspect="Content" ObjectID="_1846611440" r:id="rId148"/>
               </w:object>
             </w:r>
           </w:p>
@@ -15370,7 +15818,7 @@
               <w:rPr>
                 <w:noProof/>
               </w:rPr>
-              <w:t>8</w:t>
+              <w:t>12</w:t>
             </w:r>
             <w:r>
               <w:fldChar w:fldCharType="end"/>
@@ -15398,10 +15846,10 @@
           <w:position w:val="-12"/>
         </w:rPr>
         <w:object w:dxaOrig="360" w:dyaOrig="360" w14:anchorId="5207E33A">
-          <v:shape id="_x0000_i1080" type="#_x0000_t75" style="width:18pt;height:18pt" o:ole="">
-            <v:imagedata r:id="rId141" o:title=""/>
+          <v:shape id="_x0000_i1081" type="#_x0000_t75" style="width:18.5pt;height:18.5pt" o:ole="">
+            <v:imagedata r:id="rId149" o:title=""/>
           </v:shape>
-          <o:OLEObject Type="Embed" ProgID="Equation.DSMT4" ShapeID="_x0000_i1080" DrawAspect="Content" ObjectID="_1844883332" r:id="rId142"/>
+          <o:OLEObject Type="Embed" ProgID="Equation.DSMT4" ShapeID="_x0000_i1081" DrawAspect="Content" ObjectID="_1846611441" r:id="rId150"/>
         </w:object>
       </w:r>
       <w:r>
@@ -15421,10 +15869,10 @@
           <w:position w:val="-14"/>
         </w:rPr>
         <w:object w:dxaOrig="580" w:dyaOrig="380" w14:anchorId="52980EA0">
-          <v:shape id="_x0000_i1081" type="#_x0000_t75" style="width:29.25pt;height:18.75pt" o:ole="">
-            <v:imagedata r:id="rId130" o:title=""/>
+          <v:shape id="_x0000_i1082" type="#_x0000_t75" style="width:29pt;height:19pt" o:ole="">
+            <v:imagedata r:id="rId138" o:title=""/>
           </v:shape>
-          <o:OLEObject Type="Embed" ProgID="Equation.DSMT4" ShapeID="_x0000_i1081" DrawAspect="Content" ObjectID="_1844883333" r:id="rId143"/>
+          <o:OLEObject Type="Embed" ProgID="Equation.DSMT4" ShapeID="_x0000_i1082" DrawAspect="Content" ObjectID="_1846611442" r:id="rId151"/>
         </w:object>
       </w:r>
       <w:r>
@@ -15438,10 +15886,10 @@
           <w:position w:val="-12"/>
         </w:rPr>
         <w:object w:dxaOrig="300" w:dyaOrig="360" w14:anchorId="290404AF">
-          <v:shape id="_x0000_i1082" type="#_x0000_t75" style="width:15pt;height:18pt" o:ole="">
-            <v:imagedata r:id="rId144" o:title=""/>
+          <v:shape id="_x0000_i1083" type="#_x0000_t75" style="width:15pt;height:18.5pt" o:ole="">
+            <v:imagedata r:id="rId152" o:title=""/>
           </v:shape>
-          <o:OLEObject Type="Embed" ProgID="Equation.DSMT4" ShapeID="_x0000_i1082" DrawAspect="Content" ObjectID="_1844883334" r:id="rId145"/>
+          <o:OLEObject Type="Embed" ProgID="Equation.DSMT4" ShapeID="_x0000_i1083" DrawAspect="Content" ObjectID="_1846611443" r:id="rId153"/>
         </w:object>
       </w:r>
       <w:r>
@@ -15455,10 +15903,10 @@
           <w:position w:val="-12"/>
         </w:rPr>
         <w:object w:dxaOrig="360" w:dyaOrig="360" w14:anchorId="725081E7">
-          <v:shape id="_x0000_i1083" type="#_x0000_t75" style="width:18pt;height:18pt" o:ole="">
-            <v:imagedata r:id="rId141" o:title=""/>
+          <v:shape id="_x0000_i1084" type="#_x0000_t75" style="width:18.5pt;height:18.5pt" o:ole="">
+            <v:imagedata r:id="rId149" o:title=""/>
           </v:shape>
-          <o:OLEObject Type="Embed" ProgID="Equation.DSMT4" ShapeID="_x0000_i1083" DrawAspect="Content" ObjectID="_1844883335" r:id="rId146"/>
+          <o:OLEObject Type="Embed" ProgID="Equation.DSMT4" ShapeID="_x0000_i1084" DrawAspect="Content" ObjectID="_1846611444" r:id="rId154"/>
         </w:object>
       </w:r>
       <w:r>
@@ -15495,7 +15943,7 @@
         <w:rPr>
           <w:noProof/>
         </w:rPr>
-        <w:t>9</w:t>
+        <w:t>13</w:t>
       </w:r>
       <w:r>
         <w:rPr>
@@ -15547,10 +15995,10 @@
                 <w:position w:val="-14"/>
               </w:rPr>
               <w:object w:dxaOrig="1340" w:dyaOrig="380" w14:anchorId="02FB0467">
-                <v:shape id="_x0000_i1084" type="#_x0000_t75" style="width:66.75pt;height:18.75pt" o:ole="">
-                  <v:imagedata r:id="rId147" o:title=""/>
+                <v:shape id="_x0000_i1085" type="#_x0000_t75" style="width:66.5pt;height:19pt" o:ole="">
+                  <v:imagedata r:id="rId155" o:title=""/>
                 </v:shape>
-                <o:OLEObject Type="Embed" ProgID="Equation.DSMT4" ShapeID="_x0000_i1084" DrawAspect="Content" ObjectID="_1844883336" r:id="rId148"/>
+                <o:OLEObject Type="Embed" ProgID="Equation.DSMT4" ShapeID="_x0000_i1085" DrawAspect="Content" ObjectID="_1846611445" r:id="rId156"/>
               </w:object>
             </w:r>
           </w:p>
@@ -15590,7 +16038,7 @@
               <w:rPr>
                 <w:noProof/>
               </w:rPr>
-              <w:t>9</w:t>
+              <w:t>13</w:t>
             </w:r>
             <w:r>
               <w:fldChar w:fldCharType="end"/>
@@ -15676,7 +16124,7 @@
                           </pic:cNvPicPr>
                         </pic:nvPicPr>
                         <pic:blipFill>
-                          <a:blip r:embed="rId149">
+                          <a:blip r:embed="rId157">
                             <a:extLst>
                               <a:ext uri="{28A0092B-C50C-407E-A947-70E740481C1C}">
                                 <a14:useLocalDpi xmlns:a14="http://schemas.microsoft.com/office/drawing/2010/main" val="0"/>
@@ -15838,10 +16286,10 @@
           <w:lang w:val="en-US"/>
         </w:rPr>
         <w:object w:dxaOrig="400" w:dyaOrig="380" w14:anchorId="03A4AA7B">
-          <v:shape id="_x0000_i1085" type="#_x0000_t75" style="width:20.25pt;height:18.75pt" o:ole="">
-            <v:imagedata r:id="rId150" o:title=""/>
+          <v:shape id="_x0000_i1086" type="#_x0000_t75" style="width:20.5pt;height:19pt" o:ole="">
+            <v:imagedata r:id="rId158" o:title=""/>
           </v:shape>
-          <o:OLEObject Type="Embed" ProgID="Equation.DSMT4" ShapeID="_x0000_i1085" DrawAspect="Content" ObjectID="_1844883337" r:id="rId151"/>
+          <o:OLEObject Type="Embed" ProgID="Equation.DSMT4" ShapeID="_x0000_i1086" DrawAspect="Content" ObjectID="_1846611446" r:id="rId159"/>
         </w:object>
       </w:r>
       <w:r>
@@ -15903,7 +16351,7 @@
         <w:rPr>
           <w:noProof/>
         </w:rPr>
-        <w:t>10</w:t>
+        <w:t>14</w:t>
       </w:r>
       <w:r>
         <w:rPr>
@@ -15959,10 +16407,10 @@
                 <w:position w:val="-38"/>
               </w:rPr>
               <w:object w:dxaOrig="3420" w:dyaOrig="880" w14:anchorId="04B30234">
-                <v:shape id="_x0000_i1086" type="#_x0000_t75" style="width:171pt;height:44.25pt" o:ole="">
-                  <v:imagedata r:id="rId152" o:title=""/>
+                <v:shape id="_x0000_i1087" type="#_x0000_t75" style="width:171pt;height:44pt" o:ole="">
+                  <v:imagedata r:id="rId160" o:title=""/>
                 </v:shape>
-                <o:OLEObject Type="Embed" ProgID="Equation.DSMT4" ShapeID="_x0000_i1086" DrawAspect="Content" ObjectID="_1844883338" r:id="rId153"/>
+                <o:OLEObject Type="Embed" ProgID="Equation.DSMT4" ShapeID="_x0000_i1087" DrawAspect="Content" ObjectID="_1846611447" r:id="rId161"/>
               </w:object>
             </w:r>
           </w:p>
@@ -16002,7 +16450,7 @@
               <w:rPr>
                 <w:noProof/>
               </w:rPr>
-              <w:t>10</w:t>
+              <w:t>14</w:t>
             </w:r>
             <w:r>
               <w:fldChar w:fldCharType="end"/>
@@ -16055,6 +16503,7 @@
           <w:rFonts w:hint="eastAsia"/>
           <w:lang w:val="en-CA"/>
         </w:rPr>
+        <w:lastRenderedPageBreak/>
         <w:t>設計參數範圍</w:t>
       </w:r>
       <w:bookmarkEnd w:id="51"/>
@@ -16125,7 +16574,7 @@
       </w:r>
     </w:p>
     <w:sectPr>
-      <w:footerReference w:type="default" r:id="rId154"/>
+      <w:footerReference w:type="default" r:id="rId162"/>
       <w:type w:val="continuous"/>
       <w:pgSz w:w="11906" w:h="16838"/>
       <w:pgMar w:top="1440" w:right="1800" w:bottom="1440" w:left="1800" w:header="851" w:footer="992" w:gutter="0"/>
@@ -18016,7 +18465,7 @@
     <w:lsdException w:name="Table Web 2" w:semiHidden="1" w:unhideWhenUsed="1"/>
     <w:lsdException w:name="Table Web 3" w:semiHidden="1" w:unhideWhenUsed="1"/>
     <w:lsdException w:name="Balloon Text" w:semiHidden="1" w:unhideWhenUsed="1"/>
-    <w:lsdException w:name="Table Grid" w:uiPriority="39"/>
+    <w:lsdException w:name="Table Grid" w:uiPriority="0"/>
     <w:lsdException w:name="Table Theme" w:semiHidden="1" w:unhideWhenUsed="1"/>
     <w:lsdException w:name="Placeholder Text" w:semiHidden="1"/>
     <w:lsdException w:name="No Spacing" w:uiPriority="1" w:qFormat="1"/>
@@ -18242,7 +18691,7 @@
   <w:style w:type="paragraph" w:default="1" w:styleId="a3">
     <w:name w:val="Normal"/>
     <w:qFormat/>
-    <w:rsid w:val="006E7563"/>
+    <w:rsid w:val="002F5116"/>
     <w:pPr>
       <w:widowControl w:val="0"/>
     </w:pPr>
@@ -18774,7 +19223,6 @@
   <w:style w:type="table" w:styleId="af2">
     <w:name w:val="Table Grid"/>
     <w:basedOn w:val="a5"/>
-    <w:uiPriority w:val="39"/>
     <w:rsid w:val="003C0AB7"/>
     <w:pPr>
       <w:spacing w:after="0" w:line="240" w:lineRule="auto"/>

</xml_diff>